<commit_message>
docs: add comprehensive documentation overview and update README for GitHub
</commit_message>
<xml_diff>
--- a/Software-Documentation-Agent/output/Requirements/DOC-REQ-001_Software_Requirements_Specification.docx
+++ b/Software-Documentation-Agent/output/Requirements/DOC-REQ-001_Software_Requirements_Specification.docx
@@ -19,7 +19,7 @@
     </w:p>
     <w:p>
       <w:r>
-        <w:t>Project Name: Test Application</w:t>
+        <w:t>Project Name: ChatBotAntigravity</w:t>
       </w:r>
     </w:p>
     <w:p>
@@ -37,7 +37,7 @@
     </w:p>
     <w:p>
       <w:r>
-        <w:t>Hệ thống kiểm thử khả năng bảo tồn định dạng mẫu tài liệu.</w:t>
+        <w:t>Hệ thống phần mềm ChatBotAntigravity phục vụ chuyển đổi số và tự động hóa quy trình nghiệp vụ.</w:t>
       </w:r>
     </w:p>
     <w:p>

</xml_diff>